<commit_message>
Close pre-launch audit gaps: breach coverage, policy-ID sync, CI checks
</commit_message>
<xml_diff>
--- a/templates/dpia/DPIA-template.docx
+++ b/templates/dpia/DPIA-template.docx
@@ -2429,7 +2429,7 @@
                 <w:sz w:val="20"/>
                 <w:szCs w:val="20"/>
               </w:rPr>
-              <w:t xml:space="preserve">[Yes / No — if high residual risk remains, prior consultation with the regulator (GDPR Art.36) may be required]</w:t>
+              <w:t xml:space="preserve">[Yes / No - if high residual risk remains, prior consultation with the regulator (GDPR Art.36) may be required]</w:t>
             </w:r>
           </w:p>
         </w:tc>
@@ -2770,7 +2770,7 @@
         <w:sz w:val="14"/>
         <w:szCs w:val="14"/>
       </w:rPr>
-      <w:t xml:space="preserve">Not legal advice — validate against applicable law. </w:t>
+      <w:t xml:space="preserve">Not legal advice - validate against applicable law. </w:t>
     </w:r>
     <w:r>
       <w:rPr>

</xml_diff>